<commit_message>
Peter Reading interview: fix 'some of his' and 'Work in Regress'
Co-Authored-By: Claude Sonnet 5.5 <noreply@anthropic.com>
</commit_message>
<xml_diff>
--- a/content-src/docx/I G 1997 09 09 Peter Reading 1997.docx
+++ b/content-src/docx/I G 1997 09 09 Peter Reading 1997.docx
@@ -92,7 +92,7 @@
     </w:p>
     <w:p>
       <w:r>
-        <w:t xml:space="preserve">But Reading has been fatalistic since before Swampy was born. “I did, initially, feel something could be done. I’m very doubtful now. I find it worthy that gestures are made. I have admiration for Greenpeace, but I feel they are too late.” Of the road protesters, he says similarly: “It’s high time something was done about all that.” In a recent reprise of some his earlier pieces against the car culture, he writes: “Somebody ain’t been listening / you, at the back, sit up / and fucking well pay attention.”</w:t>
+        <w:t xml:space="preserve">But Reading has been fatalistic since before Swampy was born. “I did, initially, feel something could be done. I’m very doubtful now. I find it worthy that gestures are made. I have admiration for Greenpeace, but I feel they are too late.” Of the road protesters, he says similarly: “It’s high time something was done about all that.” In a recent reprise of some of his earlier pieces against the car culture, he writes: “Somebody ain’t been listening / you, at the back, sit up / and fucking well pay attention.”</w:t>
       </w:r>
     </w:p>
     <w:p>
@@ -102,7 +102,7 @@
     </w:p>
     <w:p>
       <w:r>
-        <w:t xml:space="preserve">Reading’s latest volumes speak simply of the agonies and consolations of drink. Chinoiserie is a collection of versions of the poetry of Li Po, which ruminate on wine, love, sadness and forgetting. In Reading’s own insistent elegiac rhythms, their resonance is unsettling: a stance such as “What to do / late in life / but sing my songs / and forget?” is offset by “Every day / of the year / I drink / till I slump / Though you / married me / any sot / would do.” His new collection, Work In Regress, refers to the consolations of verse, viticulture and love (“in order of merit”, he remarks sardonically).</w:t>
+        <w:t xml:space="preserve">Reading’s latest volumes speak simply of the agonies and consolations of drink. Chinoiserie is a collection of versions of the poetry of Li Po, which ruminate on wine, love, sadness and forgetting. In Reading’s own insistent elegiac rhythms, their resonance is unsettling: a stance such as “What to do / late in life / but sing my songs / and forget?” is offset by “Every day / of the year / I drink / till I slump / Though you / married me / any sot / would do.” His new collection, Work in Regress, refers to the consolations of verse, viticulture and love (“in order of merit”, he remarks sardonically).</w:t>
       </w:r>
     </w:p>
     <w:p>

</xml_diff>